<commit_message>
Update prototype without Fab assets
</commit_message>
<xml_diff>
--- a/Docs/Basic Attack Design Document.docx
+++ b/Docs/Basic Attack Design Document.docx
@@ -168,19 +168,25 @@
         <w:rPr>
           <w:rtl w:val="0"/>
         </w:rPr>
-        <w:t xml:space="preserve">ЛКМ — выполнить атаку</w:t>
-      </w:r>
-    </w:p>
-    <w:p>
-      <w:pPr>
-        <w:spacing w:after="240" w:before="240" w:lineRule="auto"/>
-        <w:rPr/>
-      </w:pPr>
-      <w:r>
-        <w:rPr>
-          <w:rtl w:val="0"/>
-        </w:rPr>
-        <w:t xml:space="preserve">Удержание ЛКМ — выполнять серию атак(подумать может нет сделать настраивамой)</w:t>
+        <w:t xml:space="preserve">Кнопка X на геймпаде</w:t>
+      </w:r>
+      <w:r>
+        <w:rPr>
+          <w:rtl w:val="0"/>
+        </w:rPr>
+        <w:t xml:space="preserve"> — выполнить атаку</w:t>
+      </w:r>
+    </w:p>
+    <w:p>
+      <w:pPr>
+        <w:spacing w:after="240" w:before="240" w:lineRule="auto"/>
+        <w:rPr/>
+      </w:pPr>
+      <w:r>
+        <w:rPr>
+          <w:rtl w:val="0"/>
+        </w:rPr>
+        <w:t xml:space="preserve">Много жатиеи на геймпаде X — выполнять серию атак(подумать может нет сделать настраивамой)</w:t>
       </w:r>
     </w:p>
     <w:p>

</xml_diff>